<commit_message>
Update resume profile wording and timezone format
Co-Authored-By: Claude Sonnet 5 <noreply@anthropic.com>
</commit_message>
<xml_diff>
--- a/Ayub Leon - Resume.docx
+++ b/Ayub Leon - Resume.docx
@@ -40,7 +40,7 @@
           <w:sz w:val="20"/>
           <w:szCs w:val="20"/>
         </w:rPr>
-        <w:t xml:space="preserve">Nairobi, Kenya (EAT) · Remote — schedule flexible to align with US business hours (PST/EST) by arrangement</w:t>
+        <w:t xml:space="preserve">Nairobi, Kenya (UTC+3) · Remote — schedule flexible to align with US business hours (UTC-8/-5) by arrangement</w:t>
       </w:r>
     </w:p>
     <w:p>
@@ -130,7 +130,7 @@
           <w:sz w:val="20"/>
           <w:szCs w:val="20"/>
         </w:rPr>
-        <w:t xml:space="preserve">Product Designer with 4+ years taking digital products from research and strategy through to shipped, tested interfaces. Sole designer on BuzzIQ, a TikTok Shop intelligence platform, owning the full product design lifecycle from UX strategy and information architecture through high-fidelity prototyping, design systems, and post-launch QA. Comfortable owning ambiguity: known for turning a loose brief or a blank page into a coherent product direction, then building the design system that lets a team ship it fast. Integrates AI tools into the design process to move faster and think more systematically, from research synthesis to prototyping.</w:t>
+        <w:t xml:space="preserve">Product Designer with 4+ years taking digital products from research and strategy through to shipped, tested interfaces. Led end-to-end product design for BuzzIQ (TikTok Shop intelligence platform): UX strategy, IA, design system (30 components, 400+ variants), and post-launch QA across 3+ sprints. Thrives in ambiguity: translates vague briefs into clear product strategy and design systems that unblock engineering and accelerate shipping. Integrates AI tools into the design process to move faster and think more systematically, from research synthesis to prototyping.</w:t>
       </w:r>
     </w:p>
     <w:p>
@@ -268,21 +268,21 @@
         <w:spacing w:after="50"/>
       </w:pPr>
       <w:r>
-        <w:t xml:space="preserve">Client engagement: IGNITEAMZ contracted PackCommerce as sole product designer on BuzzIQ, a TikTok Shop intelligence platform (2025 – 2026). Owned UX strategy, information architecture, visual design, and full responsive web + mobile design end-to-end.</w:t>
-      </w:r>
-    </w:p>
-    <w:p>
-      <w:pPr>
-        <w:pStyle w:val="ListParagraph"/>
-        <w:pStyle w:val="bodyText"/>
-        <w:numPr>
-          <w:ilvl w:val="0"/>
-          <w:numId w:val="1"/>
-        </w:numPr>
-        <w:spacing w:after="50"/>
-      </w:pPr>
-      <w:r>
-        <w:t xml:space="preserve">Built BuzzIQ's design system in shadcn/ui — 30 components, 400+ variants — standardising the product's UI and directly accelerating front-end development velocity for the engineering team.</w:t>
+        <w:t xml:space="preserve">Client engagement: IGNITEAMZ contracted PackCommerce as sole product designer on BuzzIQ, a TikTok Shop intelligence platform (2025). Owned UX strategy, information architecture, visual design, and full responsive web + mobile design end-to-end.</w:t>
+      </w:r>
+    </w:p>
+    <w:p>
+      <w:pPr>
+        <w:pStyle w:val="ListParagraph"/>
+        <w:pStyle w:val="bodyText"/>
+        <w:numPr>
+          <w:ilvl w:val="0"/>
+          <w:numId w:val="1"/>
+        </w:numPr>
+        <w:spacing w:after="50"/>
+      </w:pPr>
+      <w:r>
+        <w:t xml:space="preserve">Designed and shipped BuzzIQ's design system (30 components, 400+ variants in shadcn/ui), reducing front-end development time and enabling faster feature iteration.</w:t>
       </w:r>
     </w:p>
     <w:p>
@@ -428,7 +428,7 @@
         <w:spacing w:after="50"/>
       </w:pPr>
       <w:r>
-        <w:t xml:space="preserve">Designed a maternal health alert system for Kilifi County, automating vaccine reminders and delivery slot notifications for pregnant women.</w:t>
+        <w:t xml:space="preserve">Designed maternal health alert system for Kilifi County: automated vaccine reminders and delivery notifications, improving care coordination for pregnant women.</w:t>
       </w:r>
     </w:p>
     <w:p>

</xml_diff>